<commit_message>
Add branch document inventories and precise game concept glossary
</commit_message>
<xml_diff>
--- a/docs/NEXT_AI_HANDOFF.zh-CN.docx
+++ b/docs/NEXT_AI_HANDOFF.zh-CN.docx
@@ -13,6 +13,11 @@
     <w:p>
       <w:r>
         <w:t>本说明汇总用户多轮修改后的最终要求，并对照当前已确认源码核验。用途是继续合并游戏与动画，不是重新设计已通过的玩法。最新明确要求优先于旧文档；下文特别标出的待接入内容，不代表已经完成。</w:t>
+      </w:r>
+    </w:p>
+    <w:p>
+      <w:r>
+        <w:t>配套文档：分支与文档地图（BRANCH_DOCUMENT_MAP.zh-CN.md）列出每个现存分支的文档；游戏概念与界面元素词典（GAME_CONCEPTS.zh-CN.md）统一数字、标准、权重、投入与观察证据的含义。</w:t>
       </w:r>
     </w:p>
     <w:p>
@@ -460,7 +465,7 @@
     </w:p>
     <w:p>
       <w:r>
-        <w:t>每项具体标准读取 src/shared/data/metrics.ts 的 assessmentCriteria，不要只给模糊数值。</w:t>
+        <w:t>每项具体标准读取 src/levels/level1/metrics.ts 的 assessmentCriteria，不要只给模糊数值。</w:t>
       </w:r>
     </w:p>
     <w:p>
@@ -934,7 +939,7 @@
         <w:pStyle w:val="ListBullet"/>
       </w:pPr>
       <w:r>
-        <w:t>Students 核心反馈 Stops when the criteria are met.。进入 Level 3 后，符合情形的学生状态和提示应接续这一点。</w:t>
+        <w:t>Level 2 各阶段的 Students 文案以该关 data.ts 为准（详见概念词典）。进入 Level 3 后，无低投入项时显示 Stops when the criteria are met.，承接“达标成为目标”的问题；不要把这句话强行替换第二关全部阶段。</w:t>
       </w:r>
     </w:p>
     <w:p>
@@ -2109,7 +2114,7 @@
           </w:tcPr>
           <w:p>
             <w:r>
-              <w:t>六项与评价标准</w:t>
+              <w:t>六项共用名称／Level 1 评价标准与数值</w:t>
             </w:r>
           </w:p>
         </w:tc>
@@ -2119,7 +2124,7 @@
           </w:tcPr>
           <w:p>
             <w:r>
-              <w:t>src/shared/data/metrics.ts</w:t>
+              <w:t>src/shared/data/metrics.ts、src/levels/level1/metrics.ts</w:t>
             </w:r>
           </w:p>
         </w:tc>

</xml_diff>